<commit_message>
Rename project orientation doc to AGENTS.md
Internal references in PLAN.md, ui/pbc.py, and the audit doc
(docs/AUDIT_PLAN_2026-05-07.docx) updated to match the new filename.
The .gitignore pattern for `.claude/settings.local.json` stays as
that's a literal filesystem path; the comment was generalized.
</commit_message>
<xml_diff>
--- a/docs/AUDIT_PLAN_2026-05-07.docx
+++ b/docs/AUDIT_PLAN_2026-05-07.docx
@@ -159,7 +159,7 @@
         <w:t xml:space="preserve">PBCSection.refresh_all</w:t>
       </w:r>
       <w:r>
-        <w:t xml:space="preserve"> — CLAUDE.md describes a sync chain that does nothing.</w:t>
+        <w:t xml:space="preserve"> — AGENTS.md describes a sync chain that does nothing.</w:t>
       </w:r>
     </w:p>
     <w:p>
@@ -197,7 +197,7 @@
         <w:t xml:space="preserve">Documentation is one day stale</w:t>
       </w:r>
       <w:r>
-        <w:t xml:space="preserve">: CLAUDE.md, README.md, and memory files all say "Phase 8 in progress" but PLAN.md and the code prove it's complete.</w:t>
+        <w:t xml:space="preserve">: AGENTS.md, README.md, and memory files all say "Phase 8 in progress" but PLAN.md and the code prove it's complete.</w:t>
       </w:r>
     </w:p>
     <w:p>
@@ -999,7 +999,7 @@
               <w:spacing w:after="0"/>
             </w:pPr>
             <w:r>
-              <w:t xml:space="preserve">PBCSection.refresh_all is a no-op despite being documented in CLAUDE.md as the cross-room sync chain</w:t>
+              <w:t xml:space="preserve">PBCSection.refresh_all is a no-op despite being documented in AGENTS.md as the cross-room sync chain</w:t>
             </w:r>
           </w:p>
         </w:tc>
@@ -1335,7 +1335,7 @@
               <w:spacing w:after="0"/>
             </w:pPr>
             <w:r>
-              <w:t xml:space="preserve">CLAUDE.md docstring already says strings; future-proof</w:t>
+              <w:t xml:space="preserve">AGENTS.md docstring already says strings; future-proof</w:t>
             </w:r>
           </w:p>
         </w:tc>
@@ -1414,7 +1414,7 @@
           <w:sz w:val="20"/>
           <w:szCs w:val="20"/>
         </w:rPr>
-        <w:t xml:space="preserve">CLAUDE.md</w:t>
+        <w:t xml:space="preserve">AGENTS.md</w:t>
       </w:r>
       <w:r>
         <w:t xml:space="preserve"> — rewrite "Status snapshot" + "Architecture cheat sheet" to reflect generate_pbc_page / extend_template_pages / replicate_paper_space_layouts shipping. Drop "tomorrow's task is Phase 8 step 4."</w:t>
@@ -1558,7 +1558,7 @@
           <w:sz w:val="20"/>
           <w:szCs w:val="20"/>
         </w:rPr>
-        <w:t xml:space="preserve">CLAUDE.md:18</w:t>
+        <w:t xml:space="preserve">AGENTS.md:18</w:t>
       </w:r>
       <w:r>
         <w:t xml:space="preserve"> — references to </w:t>
@@ -4998,7 +4998,7 @@
         <w:t xml:space="preserve">Project hygiene audit</w:t>
       </w:r>
       <w:r>
-        <w:t xml:space="preserve"> — documentation drift between CLAUDE.md / PLAN.md / README.md / memory files / actual code; config &amp; data integrity; release-readiness of </w:t>
+        <w:t xml:space="preserve"> — documentation drift between AGENTS.md / PLAN.md / README.md / memory files / actual code; config &amp; data integrity; release-readiness of </w:t>
       </w:r>
       <w:r>
         <w:rPr>

</xml_diff>